<commit_message>
EDIT : Page Number File V3-Proposal.docx
</commit_message>
<xml_diff>
--- a/My Proposal Skripsi/V3-PROPOSAL-PAULINUS WENEHENUBUN_20210090.docx
+++ b/My Proposal Skripsi/V3-PROPOSAL-PAULINUS WENEHENUBUN_20210090.docx
@@ -158,7 +158,7 @@
                     </pic:cNvPicPr>
                   </pic:nvPicPr>
                   <pic:blipFill>
-                    <a:blip r:embed="rId6" cstate="print">
+                    <a:blip r:embed="rId8" cstate="print">
                       <a:extLst>
                         <a:ext uri="{28A0092B-C50C-407E-A947-70E740481C1C}">
                           <a14:useLocalDpi xmlns:a14="http://schemas.microsoft.com/office/drawing/2010/main" val="0"/>
@@ -530,6 +530,175 @@
           <w:sz w:val="24"/>
           <w:szCs w:val="24"/>
         </w:rPr>
+        <w:sectPr>
+          <w:headerReference w:type="even" r:id="rId9"/>
+          <w:headerReference w:type="default" r:id="rId10"/>
+          <w:footerReference w:type="even" r:id="rId11"/>
+          <w:footerReference w:type="default" r:id="rId12"/>
+          <w:headerReference w:type="first" r:id="rId13"/>
+          <w:footerReference w:type="first" r:id="rId14"/>
+          <w:pgSz w:w="11907" w:h="16840" w:code="9"/>
+          <w:pgMar w:top="1701" w:right="1701" w:bottom="1701" w:left="2268" w:header="714" w:footer="0" w:gutter="0"/>
+          <w:cols w:space="708"/>
+          <w:titlePg/>
+          <w:docGrid w:linePitch="299"/>
+        </w:sectPr>
+      </w:pPr>
+    </w:p>
+    <w:p>
+      <w:pPr>
+        <w:spacing w:after="0" w:line="360" w:lineRule="auto"/>
+        <w:jc w:val="center"/>
+        <w:rPr>
+          <w:rFonts w:ascii="Times New Roman" w:hAnsi="Times New Roman" w:cs="Times New Roman"/>
+          <w:b/>
+          <w:sz w:val="24"/>
+          <w:szCs w:val="24"/>
+        </w:rPr>
+      </w:pPr>
+      <w:r>
+        <w:rPr>
+          <w:rFonts w:ascii="Times New Roman" w:hAnsi="Times New Roman" w:cs="Times New Roman"/>
+          <w:b/>
+          <w:sz w:val="24"/>
+          <w:szCs w:val="24"/>
+        </w:rPr>
+        <w:lastRenderedPageBreak/>
+        <w:t>DAFTAR ISI</w:t>
+      </w:r>
+    </w:p>
+    <w:p>
+      <w:pPr>
+        <w:rPr>
+          <w:rFonts w:ascii="Times New Roman" w:hAnsi="Times New Roman" w:cs="Times New Roman"/>
+          <w:b/>
+          <w:sz w:val="24"/>
+          <w:szCs w:val="24"/>
+        </w:rPr>
+      </w:pPr>
+      <w:r>
+        <w:rPr>
+          <w:rFonts w:ascii="Times New Roman" w:hAnsi="Times New Roman" w:cs="Times New Roman"/>
+          <w:b/>
+          <w:sz w:val="24"/>
+          <w:szCs w:val="24"/>
+        </w:rPr>
+        <w:br w:type="page"/>
+      </w:r>
+    </w:p>
+    <w:p>
+      <w:pPr>
+        <w:jc w:val="center"/>
+        <w:rPr>
+          <w:rFonts w:ascii="Times New Roman" w:hAnsi="Times New Roman" w:cs="Times New Roman"/>
+          <w:b/>
+          <w:sz w:val="24"/>
+          <w:szCs w:val="24"/>
+        </w:rPr>
+      </w:pPr>
+      <w:r>
+        <w:rPr>
+          <w:rFonts w:ascii="Times New Roman" w:hAnsi="Times New Roman" w:cs="Times New Roman"/>
+          <w:b/>
+          <w:sz w:val="24"/>
+          <w:szCs w:val="24"/>
+        </w:rPr>
+        <w:lastRenderedPageBreak/>
+        <w:t>DAFTAR GAMBAR</w:t>
+      </w:r>
+    </w:p>
+    <w:p>
+      <w:pPr>
+        <w:rPr>
+          <w:rFonts w:ascii="Times New Roman" w:hAnsi="Times New Roman" w:cs="Times New Roman"/>
+          <w:b/>
+          <w:sz w:val="24"/>
+          <w:szCs w:val="24"/>
+        </w:rPr>
+      </w:pPr>
+      <w:r>
+        <w:rPr>
+          <w:rFonts w:ascii="Times New Roman" w:hAnsi="Times New Roman" w:cs="Times New Roman"/>
+          <w:b/>
+          <w:sz w:val="24"/>
+          <w:szCs w:val="24"/>
+        </w:rPr>
+        <w:br w:type="page"/>
+      </w:r>
+    </w:p>
+    <w:p>
+      <w:pPr>
+        <w:spacing w:after="0" w:line="360" w:lineRule="auto"/>
+        <w:jc w:val="center"/>
+        <w:rPr>
+          <w:rFonts w:ascii="Times New Roman" w:hAnsi="Times New Roman" w:cs="Times New Roman"/>
+          <w:b/>
+          <w:sz w:val="24"/>
+          <w:szCs w:val="24"/>
+        </w:rPr>
+      </w:pPr>
+      <w:r>
+        <w:rPr>
+          <w:rFonts w:ascii="Times New Roman" w:hAnsi="Times New Roman" w:cs="Times New Roman"/>
+          <w:b/>
+          <w:sz w:val="24"/>
+          <w:szCs w:val="24"/>
+        </w:rPr>
+        <w:lastRenderedPageBreak/>
+        <w:t>DAFTAR TABEL</w:t>
+      </w:r>
+    </w:p>
+    <w:p>
+      <w:pPr>
+        <w:rPr>
+          <w:rFonts w:ascii="Times New Roman" w:hAnsi="Times New Roman" w:cs="Times New Roman"/>
+          <w:b/>
+          <w:sz w:val="24"/>
+          <w:szCs w:val="24"/>
+        </w:rPr>
+      </w:pPr>
+      <w:r>
+        <w:rPr>
+          <w:rFonts w:ascii="Times New Roman" w:hAnsi="Times New Roman" w:cs="Times New Roman"/>
+          <w:b/>
+          <w:sz w:val="24"/>
+          <w:szCs w:val="24"/>
+        </w:rPr>
+        <w:br w:type="page"/>
+      </w:r>
+    </w:p>
+    <w:p>
+      <w:pPr>
+        <w:spacing w:after="0" w:line="360" w:lineRule="auto"/>
+        <w:jc w:val="center"/>
+        <w:rPr>
+          <w:rFonts w:ascii="Times New Roman" w:hAnsi="Times New Roman" w:cs="Times New Roman"/>
+          <w:b/>
+          <w:sz w:val="24"/>
+          <w:szCs w:val="24"/>
+        </w:rPr>
+        <w:sectPr>
+          <w:footerReference w:type="default" r:id="rId15"/>
+          <w:footerReference w:type="first" r:id="rId16"/>
+          <w:pgSz w:w="11907" w:h="16840" w:code="9"/>
+          <w:pgMar w:top="1701" w:right="1701" w:bottom="1701" w:left="2268" w:header="714" w:footer="0" w:gutter="0"/>
+          <w:pgNumType w:fmt="lowerRoman" w:start="1"/>
+          <w:cols w:space="708"/>
+          <w:titlePg/>
+          <w:docGrid w:linePitch="299"/>
+        </w:sectPr>
+      </w:pPr>
+    </w:p>
+    <w:p>
+      <w:pPr>
+        <w:spacing w:after="0" w:line="360" w:lineRule="auto"/>
+        <w:jc w:val="center"/>
+        <w:rPr>
+          <w:rFonts w:ascii="Times New Roman" w:hAnsi="Times New Roman" w:cs="Times New Roman"/>
+          <w:b/>
+          <w:sz w:val="24"/>
+          <w:szCs w:val="24"/>
+        </w:rPr>
       </w:pPr>
       <w:r>
         <w:rPr>
@@ -5475,27 +5644,7 @@
           <w:sz w:val="24"/>
           <w:szCs w:val="24"/>
         </w:rPr>
-        <w:t xml:space="preserve"> </w:t>
-      </w:r>
-      <w:proofErr w:type="spellStart"/>
-      <w:r>
-        <w:rPr>
-          <w:rFonts w:ascii="Times New Roman" w:hAnsi="Times New Roman" w:cs="Times New Roman"/>
-          <w:bCs/>
-          <w:sz w:val="24"/>
-          <w:szCs w:val="24"/>
-        </w:rPr>
-        <w:t>Tondano</w:t>
-      </w:r>
-      <w:proofErr w:type="spellEnd"/>
-      <w:r>
-        <w:rPr>
-          <w:rFonts w:ascii="Times New Roman" w:hAnsi="Times New Roman" w:cs="Times New Roman"/>
-          <w:bCs/>
-          <w:sz w:val="24"/>
-          <w:szCs w:val="24"/>
-        </w:rPr>
-        <w:t xml:space="preserve">, </w:t>
+        <w:t xml:space="preserve"> Tondano, </w:t>
       </w:r>
       <w:proofErr w:type="spellStart"/>
       <w:r>
@@ -16146,7 +16295,7 @@
                     <pic:cNvPicPr/>
                   </pic:nvPicPr>
                   <pic:blipFill>
-                    <a:blip r:embed="rId7" cstate="print"/>
+                    <a:blip r:embed="rId17" cstate="print"/>
                     <a:stretch>
                       <a:fillRect/>
                     </a:stretch>
@@ -20748,47 +20897,7 @@
                 <w:sz w:val="24"/>
                 <w:szCs w:val="24"/>
               </w:rPr>
-              <w:t xml:space="preserve">Ahmad </w:t>
-            </w:r>
-            <w:proofErr w:type="spellStart"/>
-            <w:r>
-              <w:rPr>
-                <w:rFonts w:ascii="Times New Roman" w:hAnsi="Times New Roman" w:cs="Times New Roman"/>
-                <w:bCs/>
-                <w:sz w:val="24"/>
-                <w:szCs w:val="24"/>
-              </w:rPr>
-              <w:t>Ashifuddin</w:t>
-            </w:r>
-            <w:proofErr w:type="spellEnd"/>
-            <w:r>
-              <w:rPr>
-                <w:rFonts w:ascii="Times New Roman" w:hAnsi="Times New Roman" w:cs="Times New Roman"/>
-                <w:bCs/>
-                <w:sz w:val="24"/>
-                <w:szCs w:val="24"/>
-              </w:rPr>
-              <w:t xml:space="preserve"> </w:t>
-            </w:r>
-            <w:proofErr w:type="spellStart"/>
-            <w:r>
-              <w:rPr>
-                <w:rFonts w:ascii="Times New Roman" w:hAnsi="Times New Roman" w:cs="Times New Roman"/>
-                <w:bCs/>
-                <w:sz w:val="24"/>
-                <w:szCs w:val="24"/>
-              </w:rPr>
-              <w:t>Aqham</w:t>
-            </w:r>
-            <w:proofErr w:type="spellEnd"/>
-            <w:r>
-              <w:rPr>
-                <w:rFonts w:ascii="Times New Roman" w:hAnsi="Times New Roman" w:cs="Times New Roman"/>
-                <w:bCs/>
-                <w:sz w:val="24"/>
-                <w:szCs w:val="24"/>
-              </w:rPr>
-              <w:t>, Edy Siswanto, Dendy Kurniawan</w:t>
+              <w:t>Ahmad Ashifuddin Aqham, Edy Siswanto, Dendy Kurniawan</w:t>
             </w:r>
           </w:p>
         </w:tc>
@@ -21371,27 +21480,7 @@
                 <w:sz w:val="24"/>
                 <w:szCs w:val="24"/>
               </w:rPr>
-              <w:t xml:space="preserve">Maria Christa </w:t>
-            </w:r>
-            <w:proofErr w:type="spellStart"/>
-            <w:r>
-              <w:rPr>
-                <w:rFonts w:ascii="Times New Roman" w:hAnsi="Times New Roman" w:cs="Times New Roman"/>
-                <w:bCs/>
-                <w:sz w:val="24"/>
-                <w:szCs w:val="24"/>
-              </w:rPr>
-              <w:t>Uskono</w:t>
-            </w:r>
-            <w:proofErr w:type="spellEnd"/>
-            <w:r>
-              <w:rPr>
-                <w:rFonts w:ascii="Times New Roman" w:hAnsi="Times New Roman" w:cs="Times New Roman"/>
-                <w:bCs/>
-                <w:sz w:val="24"/>
-                <w:szCs w:val="24"/>
-              </w:rPr>
-              <w:t xml:space="preserve">, </w:t>
+              <w:t xml:space="preserve">Maria Christa Uskono, </w:t>
             </w:r>
             <w:proofErr w:type="spellStart"/>
             <w:r>
@@ -22292,7 +22381,6 @@
                 <w:sz w:val="24"/>
                 <w:szCs w:val="24"/>
               </w:rPr>
-              <w:lastRenderedPageBreak/>
               <w:t>6</w:t>
             </w:r>
           </w:p>
@@ -22381,47 +22469,7 @@
                 <w:sz w:val="24"/>
                 <w:szCs w:val="24"/>
               </w:rPr>
-              <w:t xml:space="preserve"> </w:t>
-            </w:r>
-            <w:proofErr w:type="spellStart"/>
-            <w:r>
-              <w:rPr>
-                <w:rFonts w:ascii="Times New Roman" w:hAnsi="Times New Roman" w:cs="Times New Roman"/>
-                <w:bCs/>
-                <w:sz w:val="24"/>
-                <w:szCs w:val="24"/>
-              </w:rPr>
-              <w:t>Ismiyarti</w:t>
-            </w:r>
-            <w:proofErr w:type="spellEnd"/>
-            <w:r>
-              <w:rPr>
-                <w:rFonts w:ascii="Times New Roman" w:hAnsi="Times New Roman" w:cs="Times New Roman"/>
-                <w:bCs/>
-                <w:sz w:val="24"/>
-                <w:szCs w:val="24"/>
-              </w:rPr>
-              <w:t xml:space="preserve">, </w:t>
-            </w:r>
-            <w:proofErr w:type="spellStart"/>
-            <w:r>
-              <w:rPr>
-                <w:rFonts w:ascii="Times New Roman" w:hAnsi="Times New Roman" w:cs="Times New Roman"/>
-                <w:bCs/>
-                <w:sz w:val="24"/>
-                <w:szCs w:val="24"/>
-              </w:rPr>
-              <w:t>Ekastini</w:t>
-            </w:r>
-            <w:proofErr w:type="spellEnd"/>
-            <w:r>
-              <w:rPr>
-                <w:rFonts w:ascii="Times New Roman" w:hAnsi="Times New Roman" w:cs="Times New Roman"/>
-                <w:bCs/>
-                <w:sz w:val="24"/>
-                <w:szCs w:val="24"/>
-              </w:rPr>
-              <w:t xml:space="preserve">, Fadhli </w:t>
+              <w:t xml:space="preserve"> Ismiyarti, Ekastini, Fadhli </w:t>
             </w:r>
             <w:proofErr w:type="spellStart"/>
             <w:r>
@@ -22481,47 +22529,7 @@
                 <w:sz w:val="24"/>
                 <w:szCs w:val="24"/>
               </w:rPr>
-              <w:t xml:space="preserve"> </w:t>
-            </w:r>
-            <w:proofErr w:type="spellStart"/>
-            <w:r>
-              <w:rPr>
-                <w:rFonts w:ascii="Times New Roman" w:hAnsi="Times New Roman" w:cs="Times New Roman"/>
-                <w:bCs/>
-                <w:sz w:val="24"/>
-                <w:szCs w:val="24"/>
-              </w:rPr>
-              <w:t>Robbani</w:t>
-            </w:r>
-            <w:proofErr w:type="spellEnd"/>
-            <w:r>
-              <w:rPr>
-                <w:rFonts w:ascii="Times New Roman" w:hAnsi="Times New Roman" w:cs="Times New Roman"/>
-                <w:bCs/>
-                <w:sz w:val="24"/>
-                <w:szCs w:val="24"/>
-              </w:rPr>
-              <w:t xml:space="preserve">, Sabri </w:t>
-            </w:r>
-            <w:proofErr w:type="spellStart"/>
-            <w:r>
-              <w:rPr>
-                <w:rFonts w:ascii="Times New Roman" w:hAnsi="Times New Roman" w:cs="Times New Roman"/>
-                <w:bCs/>
-                <w:sz w:val="24"/>
-                <w:szCs w:val="24"/>
-              </w:rPr>
-              <w:t>Balafif</w:t>
-            </w:r>
-            <w:proofErr w:type="spellEnd"/>
-            <w:r>
-              <w:rPr>
-                <w:rFonts w:ascii="Times New Roman" w:hAnsi="Times New Roman" w:cs="Times New Roman"/>
-                <w:bCs/>
-                <w:sz w:val="24"/>
-                <w:szCs w:val="24"/>
-              </w:rPr>
-              <w:t xml:space="preserve">, </w:t>
+              <w:t xml:space="preserve"> Robbani, Sabri Balafif, </w:t>
             </w:r>
             <w:proofErr w:type="spellStart"/>
             <w:r>
@@ -33841,27 +33849,7 @@
           <w:sz w:val="24"/>
           <w:szCs w:val="24"/>
         </w:rPr>
-        <w:t xml:space="preserve"> </w:t>
-      </w:r>
-      <w:proofErr w:type="spellStart"/>
-      <w:r>
-        <w:rPr>
-          <w:rFonts w:ascii="Times New Roman" w:hAnsi="Times New Roman" w:cs="Times New Roman"/>
-          <w:bCs/>
-          <w:sz w:val="24"/>
-          <w:szCs w:val="24"/>
-        </w:rPr>
-        <w:t>Sukun</w:t>
-      </w:r>
-      <w:proofErr w:type="spellEnd"/>
-      <w:r>
-        <w:rPr>
-          <w:rFonts w:ascii="Times New Roman" w:hAnsi="Times New Roman" w:cs="Times New Roman"/>
-          <w:bCs/>
-          <w:sz w:val="24"/>
-          <w:szCs w:val="24"/>
-        </w:rPr>
-        <w:t xml:space="preserve">” oleh </w:t>
+        <w:t xml:space="preserve"> Sukun” oleh </w:t>
       </w:r>
       <w:r>
         <w:rPr>
@@ -34617,19 +34605,8 @@
           <w:sz w:val="24"/>
           <w:szCs w:val="24"/>
         </w:rPr>
-        <w:t xml:space="preserve"> </w:t>
-      </w:r>
-      <w:proofErr w:type="spellStart"/>
-      <w:r>
-        <w:rPr>
-          <w:rFonts w:ascii="Times New Roman" w:hAnsi="Times New Roman" w:cs="Times New Roman"/>
-          <w:bCs/>
-          <w:sz w:val="24"/>
-          <w:szCs w:val="24"/>
-        </w:rPr>
-        <w:t>Sukun</w:t>
-      </w:r>
-      <w:proofErr w:type="spellEnd"/>
+        <w:t xml:space="preserve"> Sukun</w:t>
+      </w:r>
       <w:r>
         <w:rPr>
           <w:rFonts w:ascii="Times New Roman" w:hAnsi="Times New Roman" w:cs="Times New Roman"/>
@@ -38599,7 +38576,7 @@
                     </pic:cNvPicPr>
                   </pic:nvPicPr>
                   <pic:blipFill>
-                    <a:blip r:embed="rId8">
+                    <a:blip r:embed="rId18">
                       <a:extLst>
                         <a:ext uri="{28A0092B-C50C-407E-A947-70E740481C1C}">
                           <a14:useLocalDpi xmlns:a14="http://schemas.microsoft.com/office/drawing/2010/main" val="0"/>
@@ -51501,13 +51478,252 @@
       </w:r>
     </w:p>
     <w:sectPr>
+      <w:headerReference w:type="first" r:id="rId19"/>
+      <w:footerReference w:type="first" r:id="rId20"/>
       <w:pgSz w:w="11907" w:h="16840" w:code="9"/>
       <w:pgMar w:top="1701" w:right="1701" w:bottom="1701" w:left="2268" w:header="714" w:footer="0" w:gutter="0"/>
+      <w:pgNumType w:start="1"/>
       <w:cols w:space="708"/>
       <w:docGrid w:linePitch="299"/>
     </w:sectPr>
   </w:body>
 </w:document>
+</file>
+
+<file path=word/endnotes.xml><?xml version="1.0" encoding="utf-8"?>
+<w:endnotes xmlns:wpc="http://schemas.microsoft.com/office/word/2010/wordprocessingCanvas" xmlns:cx="http://schemas.microsoft.com/office/drawing/2014/chartex" xmlns:cx1="http://schemas.microsoft.com/office/drawing/2015/9/8/chartex" xmlns:cx2="http://schemas.microsoft.com/office/drawing/2015/10/21/chartex" xmlns:cx3="http://schemas.microsoft.com/office/drawing/2016/5/9/chartex" xmlns:cx4="http://schemas.microsoft.com/office/drawing/2016/5/10/chartex" xmlns:cx5="http://schemas.microsoft.com/office/drawing/2016/5/11/chartex" xmlns:cx6="http://schemas.microsoft.com/office/drawing/2016/5/12/chartex" xmlns:cx7="http://schemas.microsoft.com/office/drawing/2016/5/13/chartex" xmlns:cx8="http://schemas.microsoft.com/office/drawing/2016/5/14/chartex" xmlns:mc="http://schemas.openxmlformats.org/markup-compatibility/2006" xmlns:aink="http://schemas.microsoft.com/office/drawing/2016/ink" xmlns:am3d="http://schemas.microsoft.com/office/drawing/2017/model3d" xmlns:o="urn:schemas-microsoft-com:office:office" xmlns:oel="http://schemas.microsoft.com/office/2019/extlst" xmlns:r="http://schemas.openxmlformats.org/officeDocument/2006/relationships" xmlns:m="http://schemas.openxmlformats.org/officeDocument/2006/math" xmlns:v="urn:schemas-microsoft-com:vml" xmlns:wp14="http://schemas.microsoft.com/office/word/2010/wordprocessingDrawing" xmlns:wp="http://schemas.openxmlformats.org/drawingml/2006/wordprocessingDrawing" xmlns:w10="urn:schemas-microsoft-com:office:word" xmlns:w="http://schemas.openxmlformats.org/wordprocessingml/2006/main" xmlns:w14="http://schemas.microsoft.com/office/word/2010/wordml" xmlns:w15="http://schemas.microsoft.com/office/word/2012/wordml" xmlns:w16cex="http://schemas.microsoft.com/office/word/2018/wordml/cex" xmlns:w16cid="http://schemas.microsoft.com/office/word/2016/wordml/cid" xmlns:w16="http://schemas.microsoft.com/office/word/2018/wordml" xmlns:w16du="http://schemas.microsoft.com/office/word/2023/wordml/word16du" xmlns:w16sdtdh="http://schemas.microsoft.com/office/word/2020/wordml/sdtdatahash" xmlns:w16sdtfl="http://schemas.microsoft.com/office/word/2024/wordml/sdtformatlock" xmlns:w16se="http://schemas.microsoft.com/office/word/2015/wordml/symex" xmlns:wpg="http://schemas.microsoft.com/office/word/2010/wordprocessingGroup" xmlns:wpi="http://schemas.microsoft.com/office/word/2010/wordprocessingInk" xmlns:wne="http://schemas.microsoft.com/office/word/2006/wordml" xmlns:wps="http://schemas.microsoft.com/office/word/2010/wordprocessingShape" mc:Ignorable="w14 w15 w16se w16cid w16 w16cex w16sdtdh w16sdtfl w16du wp14">
+  <w:endnote w:type="separator" w:id="-1">
+    <w:p>
+      <w:pPr>
+        <w:spacing w:after="0" w:line="240" w:lineRule="auto"/>
+      </w:pPr>
+      <w:r>
+        <w:separator/>
+      </w:r>
+    </w:p>
+  </w:endnote>
+  <w:endnote w:type="continuationSeparator" w:id="0">
+    <w:p>
+      <w:pPr>
+        <w:spacing w:after="0" w:line="240" w:lineRule="auto"/>
+      </w:pPr>
+      <w:r>
+        <w:continuationSeparator/>
+      </w:r>
+    </w:p>
+  </w:endnote>
+</w:endnotes>
+</file>
+
+<file path=word/footer1.xml><?xml version="1.0" encoding="utf-8"?>
+<w:ftr xmlns:wpc="http://schemas.microsoft.com/office/word/2010/wordprocessingCanvas" xmlns:cx="http://schemas.microsoft.com/office/drawing/2014/chartex" xmlns:cx1="http://schemas.microsoft.com/office/drawing/2015/9/8/chartex" xmlns:cx2="http://schemas.microsoft.com/office/drawing/2015/10/21/chartex" xmlns:cx3="http://schemas.microsoft.com/office/drawing/2016/5/9/chartex" xmlns:cx4="http://schemas.microsoft.com/office/drawing/2016/5/10/chartex" xmlns:cx5="http://schemas.microsoft.com/office/drawing/2016/5/11/chartex" xmlns:cx6="http://schemas.microsoft.com/office/drawing/2016/5/12/chartex" xmlns:cx7="http://schemas.microsoft.com/office/drawing/2016/5/13/chartex" xmlns:cx8="http://schemas.microsoft.com/office/drawing/2016/5/14/chartex" xmlns:mc="http://schemas.openxmlformats.org/markup-compatibility/2006" xmlns:aink="http://schemas.microsoft.com/office/drawing/2016/ink" xmlns:am3d="http://schemas.microsoft.com/office/drawing/2017/model3d" xmlns:o="urn:schemas-microsoft-com:office:office" xmlns:oel="http://schemas.microsoft.com/office/2019/extlst" xmlns:r="http://schemas.openxmlformats.org/officeDocument/2006/relationships" xmlns:m="http://schemas.openxmlformats.org/officeDocument/2006/math" xmlns:v="urn:schemas-microsoft-com:vml" xmlns:wp14="http://schemas.microsoft.com/office/word/2010/wordprocessingDrawing" xmlns:wp="http://schemas.openxmlformats.org/drawingml/2006/wordprocessingDrawing" xmlns:w10="urn:schemas-microsoft-com:office:word" xmlns:w="http://schemas.openxmlformats.org/wordprocessingml/2006/main" xmlns:w14="http://schemas.microsoft.com/office/word/2010/wordml" xmlns:w15="http://schemas.microsoft.com/office/word/2012/wordml" xmlns:w16cex="http://schemas.microsoft.com/office/word/2018/wordml/cex" xmlns:w16cid="http://schemas.microsoft.com/office/word/2016/wordml/cid" xmlns:w16="http://schemas.microsoft.com/office/word/2018/wordml" xmlns:w16du="http://schemas.microsoft.com/office/word/2023/wordml/word16du" xmlns:w16sdtdh="http://schemas.microsoft.com/office/word/2020/wordml/sdtdatahash" xmlns:w16sdtfl="http://schemas.microsoft.com/office/word/2024/wordml/sdtformatlock" xmlns:w16se="http://schemas.microsoft.com/office/word/2015/wordml/symex" xmlns:wpg="http://schemas.microsoft.com/office/word/2010/wordprocessingGroup" xmlns:wpi="http://schemas.microsoft.com/office/word/2010/wordprocessingInk" xmlns:wne="http://schemas.microsoft.com/office/word/2006/wordml" xmlns:wps="http://schemas.microsoft.com/office/word/2010/wordprocessingShape" mc:Ignorable="w14 w15 w16se w16cid w16 w16cex w16sdtdh w16sdtfl w16du wp14">
+  <w:p>
+    <w:pPr>
+      <w:pStyle w:val="Footer"/>
+    </w:pPr>
+  </w:p>
+</w:ftr>
+</file>
+
+<file path=word/footer2.xml><?xml version="1.0" encoding="utf-8"?>
+<w:ftr xmlns:wpc="http://schemas.microsoft.com/office/word/2010/wordprocessingCanvas" xmlns:cx="http://schemas.microsoft.com/office/drawing/2014/chartex" xmlns:cx1="http://schemas.microsoft.com/office/drawing/2015/9/8/chartex" xmlns:cx2="http://schemas.microsoft.com/office/drawing/2015/10/21/chartex" xmlns:cx3="http://schemas.microsoft.com/office/drawing/2016/5/9/chartex" xmlns:cx4="http://schemas.microsoft.com/office/drawing/2016/5/10/chartex" xmlns:cx5="http://schemas.microsoft.com/office/drawing/2016/5/11/chartex" xmlns:cx6="http://schemas.microsoft.com/office/drawing/2016/5/12/chartex" xmlns:cx7="http://schemas.microsoft.com/office/drawing/2016/5/13/chartex" xmlns:cx8="http://schemas.microsoft.com/office/drawing/2016/5/14/chartex" xmlns:mc="http://schemas.openxmlformats.org/markup-compatibility/2006" xmlns:aink="http://schemas.microsoft.com/office/drawing/2016/ink" xmlns:am3d="http://schemas.microsoft.com/office/drawing/2017/model3d" xmlns:o="urn:schemas-microsoft-com:office:office" xmlns:oel="http://schemas.microsoft.com/office/2019/extlst" xmlns:r="http://schemas.openxmlformats.org/officeDocument/2006/relationships" xmlns:m="http://schemas.openxmlformats.org/officeDocument/2006/math" xmlns:v="urn:schemas-microsoft-com:vml" xmlns:wp14="http://schemas.microsoft.com/office/word/2010/wordprocessingDrawing" xmlns:wp="http://schemas.openxmlformats.org/drawingml/2006/wordprocessingDrawing" xmlns:w10="urn:schemas-microsoft-com:office:word" xmlns:w="http://schemas.openxmlformats.org/wordprocessingml/2006/main" xmlns:w14="http://schemas.microsoft.com/office/word/2010/wordml" xmlns:w15="http://schemas.microsoft.com/office/word/2012/wordml" xmlns:w16cex="http://schemas.microsoft.com/office/word/2018/wordml/cex" xmlns:w16cid="http://schemas.microsoft.com/office/word/2016/wordml/cid" xmlns:w16="http://schemas.microsoft.com/office/word/2018/wordml" xmlns:w16du="http://schemas.microsoft.com/office/word/2023/wordml/word16du" xmlns:w16sdtdh="http://schemas.microsoft.com/office/word/2020/wordml/sdtdatahash" xmlns:w16sdtfl="http://schemas.microsoft.com/office/word/2024/wordml/sdtformatlock" xmlns:w16se="http://schemas.microsoft.com/office/word/2015/wordml/symex" xmlns:wpg="http://schemas.microsoft.com/office/word/2010/wordprocessingGroup" xmlns:wpi="http://schemas.microsoft.com/office/word/2010/wordprocessingInk" xmlns:wne="http://schemas.microsoft.com/office/word/2006/wordml" xmlns:wps="http://schemas.microsoft.com/office/word/2010/wordprocessingShape" mc:Ignorable="w14 w15 w16se w16cid w16 w16cex w16sdtdh w16sdtfl w16du wp14">
+  <w:p>
+    <w:pPr>
+      <w:pStyle w:val="Footer"/>
+    </w:pPr>
+  </w:p>
+</w:ftr>
+</file>
+
+<file path=word/footer3.xml><?xml version="1.0" encoding="utf-8"?>
+<w:ftr xmlns:wpc="http://schemas.microsoft.com/office/word/2010/wordprocessingCanvas" xmlns:cx="http://schemas.microsoft.com/office/drawing/2014/chartex" xmlns:cx1="http://schemas.microsoft.com/office/drawing/2015/9/8/chartex" xmlns:cx2="http://schemas.microsoft.com/office/drawing/2015/10/21/chartex" xmlns:cx3="http://schemas.microsoft.com/office/drawing/2016/5/9/chartex" xmlns:cx4="http://schemas.microsoft.com/office/drawing/2016/5/10/chartex" xmlns:cx5="http://schemas.microsoft.com/office/drawing/2016/5/11/chartex" xmlns:cx6="http://schemas.microsoft.com/office/drawing/2016/5/12/chartex" xmlns:cx7="http://schemas.microsoft.com/office/drawing/2016/5/13/chartex" xmlns:cx8="http://schemas.microsoft.com/office/drawing/2016/5/14/chartex" xmlns:mc="http://schemas.openxmlformats.org/markup-compatibility/2006" xmlns:aink="http://schemas.microsoft.com/office/drawing/2016/ink" xmlns:am3d="http://schemas.microsoft.com/office/drawing/2017/model3d" xmlns:o="urn:schemas-microsoft-com:office:office" xmlns:oel="http://schemas.microsoft.com/office/2019/extlst" xmlns:r="http://schemas.openxmlformats.org/officeDocument/2006/relationships" xmlns:m="http://schemas.openxmlformats.org/officeDocument/2006/math" xmlns:v="urn:schemas-microsoft-com:vml" xmlns:wp14="http://schemas.microsoft.com/office/word/2010/wordprocessingDrawing" xmlns:wp="http://schemas.openxmlformats.org/drawingml/2006/wordprocessingDrawing" xmlns:w10="urn:schemas-microsoft-com:office:word" xmlns:w="http://schemas.openxmlformats.org/wordprocessingml/2006/main" xmlns:w14="http://schemas.microsoft.com/office/word/2010/wordml" xmlns:w15="http://schemas.microsoft.com/office/word/2012/wordml" xmlns:w16cex="http://schemas.microsoft.com/office/word/2018/wordml/cex" xmlns:w16cid="http://schemas.microsoft.com/office/word/2016/wordml/cid" xmlns:w16="http://schemas.microsoft.com/office/word/2018/wordml" xmlns:w16du="http://schemas.microsoft.com/office/word/2023/wordml/word16du" xmlns:w16sdtdh="http://schemas.microsoft.com/office/word/2020/wordml/sdtdatahash" xmlns:w16sdtfl="http://schemas.microsoft.com/office/word/2024/wordml/sdtformatlock" xmlns:w16se="http://schemas.microsoft.com/office/word/2015/wordml/symex" xmlns:wpg="http://schemas.microsoft.com/office/word/2010/wordprocessingGroup" xmlns:wpi="http://schemas.microsoft.com/office/word/2010/wordprocessingInk" xmlns:wne="http://schemas.microsoft.com/office/word/2006/wordml" xmlns:wps="http://schemas.microsoft.com/office/word/2010/wordprocessingShape" mc:Ignorable="w14 w15 w16se w16cid w16 w16cex w16sdtdh w16sdtfl w16du wp14">
+  <w:p>
+    <w:pPr>
+      <w:pStyle w:val="Footer"/>
+    </w:pPr>
+  </w:p>
+</w:ftr>
+</file>
+
+<file path=word/footer4.xml><?xml version="1.0" encoding="utf-8"?>
+<w:ftr xmlns:wpc="http://schemas.microsoft.com/office/word/2010/wordprocessingCanvas" xmlns:cx="http://schemas.microsoft.com/office/drawing/2014/chartex" xmlns:cx1="http://schemas.microsoft.com/office/drawing/2015/9/8/chartex" xmlns:cx2="http://schemas.microsoft.com/office/drawing/2015/10/21/chartex" xmlns:cx3="http://schemas.microsoft.com/office/drawing/2016/5/9/chartex" xmlns:cx4="http://schemas.microsoft.com/office/drawing/2016/5/10/chartex" xmlns:cx5="http://schemas.microsoft.com/office/drawing/2016/5/11/chartex" xmlns:cx6="http://schemas.microsoft.com/office/drawing/2016/5/12/chartex" xmlns:cx7="http://schemas.microsoft.com/office/drawing/2016/5/13/chartex" xmlns:cx8="http://schemas.microsoft.com/office/drawing/2016/5/14/chartex" xmlns:mc="http://schemas.openxmlformats.org/markup-compatibility/2006" xmlns:aink="http://schemas.microsoft.com/office/drawing/2016/ink" xmlns:am3d="http://schemas.microsoft.com/office/drawing/2017/model3d" xmlns:o="urn:schemas-microsoft-com:office:office" xmlns:oel="http://schemas.microsoft.com/office/2019/extlst" xmlns:r="http://schemas.openxmlformats.org/officeDocument/2006/relationships" xmlns:m="http://schemas.openxmlformats.org/officeDocument/2006/math" xmlns:v="urn:schemas-microsoft-com:vml" xmlns:wp14="http://schemas.microsoft.com/office/word/2010/wordprocessingDrawing" xmlns:wp="http://schemas.openxmlformats.org/drawingml/2006/wordprocessingDrawing" xmlns:w10="urn:schemas-microsoft-com:office:word" xmlns:w="http://schemas.openxmlformats.org/wordprocessingml/2006/main" xmlns:w14="http://schemas.microsoft.com/office/word/2010/wordml" xmlns:w15="http://schemas.microsoft.com/office/word/2012/wordml" xmlns:w16cex="http://schemas.microsoft.com/office/word/2018/wordml/cex" xmlns:w16cid="http://schemas.microsoft.com/office/word/2016/wordml/cid" xmlns:w16="http://schemas.microsoft.com/office/word/2018/wordml" xmlns:w16du="http://schemas.microsoft.com/office/word/2023/wordml/word16du" xmlns:w16sdtdh="http://schemas.microsoft.com/office/word/2020/wordml/sdtdatahash" xmlns:w16sdtfl="http://schemas.microsoft.com/office/word/2024/wordml/sdtformatlock" xmlns:w16se="http://schemas.microsoft.com/office/word/2015/wordml/symex" xmlns:wpg="http://schemas.microsoft.com/office/word/2010/wordprocessingGroup" xmlns:wpi="http://schemas.microsoft.com/office/word/2010/wordprocessingInk" xmlns:wne="http://schemas.microsoft.com/office/word/2006/wordml" xmlns:wps="http://schemas.microsoft.com/office/word/2010/wordprocessingShape" mc:Ignorable="w14 w15 w16se w16cid w16 w16cex w16sdtdh w16sdtfl w16du wp14">
+  <w:sdt>
+    <w:sdtPr>
+      <w:id w:val="1765804668"/>
+      <w:docPartObj>
+        <w:docPartGallery w:val="Page Numbers (Bottom of Page)"/>
+        <w:docPartUnique/>
+      </w:docPartObj>
+    </w:sdtPr>
+    <w:sdtEndPr>
+      <w:rPr>
+        <w:noProof/>
+      </w:rPr>
+    </w:sdtEndPr>
+    <w:sdtContent>
+      <w:p>
+        <w:pPr>
+          <w:pStyle w:val="Footer"/>
+          <w:jc w:val="center"/>
+        </w:pPr>
+        <w:r>
+          <w:fldChar w:fldCharType="begin"/>
+        </w:r>
+        <w:r>
+          <w:instrText xml:space="preserve"> PAGE   \* MERGEFORMAT </w:instrText>
+        </w:r>
+        <w:r>
+          <w:fldChar w:fldCharType="separate"/>
+        </w:r>
+        <w:r>
+          <w:rPr>
+            <w:noProof/>
+          </w:rPr>
+          <w:t>2</w:t>
+        </w:r>
+        <w:r>
+          <w:rPr>
+            <w:noProof/>
+          </w:rPr>
+          <w:fldChar w:fldCharType="end"/>
+        </w:r>
+      </w:p>
+    </w:sdtContent>
+  </w:sdt>
+  <w:p>
+    <w:pPr>
+      <w:pStyle w:val="Footer"/>
+    </w:pPr>
+  </w:p>
+</w:ftr>
+</file>
+
+<file path=word/footer5.xml><?xml version="1.0" encoding="utf-8"?>
+<w:ftr xmlns:wpc="http://schemas.microsoft.com/office/word/2010/wordprocessingCanvas" xmlns:cx="http://schemas.microsoft.com/office/drawing/2014/chartex" xmlns:cx1="http://schemas.microsoft.com/office/drawing/2015/9/8/chartex" xmlns:cx2="http://schemas.microsoft.com/office/drawing/2015/10/21/chartex" xmlns:cx3="http://schemas.microsoft.com/office/drawing/2016/5/9/chartex" xmlns:cx4="http://schemas.microsoft.com/office/drawing/2016/5/10/chartex" xmlns:cx5="http://schemas.microsoft.com/office/drawing/2016/5/11/chartex" xmlns:cx6="http://schemas.microsoft.com/office/drawing/2016/5/12/chartex" xmlns:cx7="http://schemas.microsoft.com/office/drawing/2016/5/13/chartex" xmlns:cx8="http://schemas.microsoft.com/office/drawing/2016/5/14/chartex" xmlns:mc="http://schemas.openxmlformats.org/markup-compatibility/2006" xmlns:aink="http://schemas.microsoft.com/office/drawing/2016/ink" xmlns:am3d="http://schemas.microsoft.com/office/drawing/2017/model3d" xmlns:o="urn:schemas-microsoft-com:office:office" xmlns:oel="http://schemas.microsoft.com/office/2019/extlst" xmlns:r="http://schemas.openxmlformats.org/officeDocument/2006/relationships" xmlns:m="http://schemas.openxmlformats.org/officeDocument/2006/math" xmlns:v="urn:schemas-microsoft-com:vml" xmlns:wp14="http://schemas.microsoft.com/office/word/2010/wordprocessingDrawing" xmlns:wp="http://schemas.openxmlformats.org/drawingml/2006/wordprocessingDrawing" xmlns:w10="urn:schemas-microsoft-com:office:word" xmlns:w="http://schemas.openxmlformats.org/wordprocessingml/2006/main" xmlns:w14="http://schemas.microsoft.com/office/word/2010/wordml" xmlns:w15="http://schemas.microsoft.com/office/word/2012/wordml" xmlns:w16cex="http://schemas.microsoft.com/office/word/2018/wordml/cex" xmlns:w16cid="http://schemas.microsoft.com/office/word/2016/wordml/cid" xmlns:w16="http://schemas.microsoft.com/office/word/2018/wordml" xmlns:w16du="http://schemas.microsoft.com/office/word/2023/wordml/word16du" xmlns:w16sdtdh="http://schemas.microsoft.com/office/word/2020/wordml/sdtdatahash" xmlns:w16sdtfl="http://schemas.microsoft.com/office/word/2024/wordml/sdtformatlock" xmlns:w16se="http://schemas.microsoft.com/office/word/2015/wordml/symex" xmlns:wpg="http://schemas.microsoft.com/office/word/2010/wordprocessingGroup" xmlns:wpi="http://schemas.microsoft.com/office/word/2010/wordprocessingInk" xmlns:wne="http://schemas.microsoft.com/office/word/2006/wordml" xmlns:wps="http://schemas.microsoft.com/office/word/2010/wordprocessingShape" mc:Ignorable="w14 w15 w16se w16cid w16 w16cex w16sdtdh w16sdtfl w16du wp14">
+  <w:sdt>
+    <w:sdtPr>
+      <w:id w:val="268666648"/>
+      <w:docPartObj>
+        <w:docPartGallery w:val="Page Numbers (Bottom of Page)"/>
+        <w:docPartUnique/>
+      </w:docPartObj>
+    </w:sdtPr>
+    <w:sdtEndPr>
+      <w:rPr>
+        <w:noProof/>
+      </w:rPr>
+    </w:sdtEndPr>
+    <w:sdtContent>
+      <w:p>
+        <w:pPr>
+          <w:pStyle w:val="Footer"/>
+          <w:jc w:val="center"/>
+        </w:pPr>
+        <w:r>
+          <w:fldChar w:fldCharType="begin"/>
+        </w:r>
+        <w:r>
+          <w:instrText xml:space="preserve"> PAGE   \* MERGEFORMAT </w:instrText>
+        </w:r>
+        <w:r>
+          <w:fldChar w:fldCharType="separate"/>
+        </w:r>
+        <w:r>
+          <w:rPr>
+            <w:noProof/>
+          </w:rPr>
+          <w:t>2</w:t>
+        </w:r>
+        <w:r>
+          <w:rPr>
+            <w:noProof/>
+          </w:rPr>
+          <w:fldChar w:fldCharType="end"/>
+        </w:r>
+      </w:p>
+    </w:sdtContent>
+  </w:sdt>
+  <w:p>
+    <w:pPr>
+      <w:pStyle w:val="Footer"/>
+    </w:pPr>
+  </w:p>
+</w:ftr>
+</file>
+
+<file path=word/footer6.xml><?xml version="1.0" encoding="utf-8"?>
+<w:ftr xmlns:wpc="http://schemas.microsoft.com/office/word/2010/wordprocessingCanvas" xmlns:cx="http://schemas.microsoft.com/office/drawing/2014/chartex" xmlns:cx1="http://schemas.microsoft.com/office/drawing/2015/9/8/chartex" xmlns:cx2="http://schemas.microsoft.com/office/drawing/2015/10/21/chartex" xmlns:cx3="http://schemas.microsoft.com/office/drawing/2016/5/9/chartex" xmlns:cx4="http://schemas.microsoft.com/office/drawing/2016/5/10/chartex" xmlns:cx5="http://schemas.microsoft.com/office/drawing/2016/5/11/chartex" xmlns:cx6="http://schemas.microsoft.com/office/drawing/2016/5/12/chartex" xmlns:cx7="http://schemas.microsoft.com/office/drawing/2016/5/13/chartex" xmlns:cx8="http://schemas.microsoft.com/office/drawing/2016/5/14/chartex" xmlns:mc="http://schemas.openxmlformats.org/markup-compatibility/2006" xmlns:aink="http://schemas.microsoft.com/office/drawing/2016/ink" xmlns:am3d="http://schemas.microsoft.com/office/drawing/2017/model3d" xmlns:o="urn:schemas-microsoft-com:office:office" xmlns:oel="http://schemas.microsoft.com/office/2019/extlst" xmlns:r="http://schemas.openxmlformats.org/officeDocument/2006/relationships" xmlns:m="http://schemas.openxmlformats.org/officeDocument/2006/math" xmlns:v="urn:schemas-microsoft-com:vml" xmlns:wp14="http://schemas.microsoft.com/office/word/2010/wordprocessingDrawing" xmlns:wp="http://schemas.openxmlformats.org/drawingml/2006/wordprocessingDrawing" xmlns:w10="urn:schemas-microsoft-com:office:word" xmlns:w="http://schemas.openxmlformats.org/wordprocessingml/2006/main" xmlns:w14="http://schemas.microsoft.com/office/word/2010/wordml" xmlns:w15="http://schemas.microsoft.com/office/word/2012/wordml" xmlns:w16cex="http://schemas.microsoft.com/office/word/2018/wordml/cex" xmlns:w16cid="http://schemas.microsoft.com/office/word/2016/wordml/cid" xmlns:w16="http://schemas.microsoft.com/office/word/2018/wordml" xmlns:w16du="http://schemas.microsoft.com/office/word/2023/wordml/word16du" xmlns:w16sdtdh="http://schemas.microsoft.com/office/word/2020/wordml/sdtdatahash" xmlns:w16sdtfl="http://schemas.microsoft.com/office/word/2024/wordml/sdtformatlock" xmlns:w16se="http://schemas.microsoft.com/office/word/2015/wordml/symex" xmlns:wpg="http://schemas.microsoft.com/office/word/2010/wordprocessingGroup" xmlns:wpi="http://schemas.microsoft.com/office/word/2010/wordprocessingInk" xmlns:wne="http://schemas.microsoft.com/office/word/2006/wordml" xmlns:wps="http://schemas.microsoft.com/office/word/2010/wordprocessingShape" mc:Ignorable="w14 w15 w16se w16cid w16 w16cex w16sdtdh w16sdtfl w16du wp14">
+  <w:p>
+    <w:pPr>
+      <w:pStyle w:val="Footer"/>
+    </w:pPr>
+  </w:p>
+</w:ftr>
+</file>
+
+<file path=word/footnotes.xml><?xml version="1.0" encoding="utf-8"?>
+<w:footnotes xmlns:wpc="http://schemas.microsoft.com/office/word/2010/wordprocessingCanvas" xmlns:cx="http://schemas.microsoft.com/office/drawing/2014/chartex" xmlns:cx1="http://schemas.microsoft.com/office/drawing/2015/9/8/chartex" xmlns:cx2="http://schemas.microsoft.com/office/drawing/2015/10/21/chartex" xmlns:cx3="http://schemas.microsoft.com/office/drawing/2016/5/9/chartex" xmlns:cx4="http://schemas.microsoft.com/office/drawing/2016/5/10/chartex" xmlns:cx5="http://schemas.microsoft.com/office/drawing/2016/5/11/chartex" xmlns:cx6="http://schemas.microsoft.com/office/drawing/2016/5/12/chartex" xmlns:cx7="http://schemas.microsoft.com/office/drawing/2016/5/13/chartex" xmlns:cx8="http://schemas.microsoft.com/office/drawing/2016/5/14/chartex" xmlns:mc="http://schemas.openxmlformats.org/markup-compatibility/2006" xmlns:aink="http://schemas.microsoft.com/office/drawing/2016/ink" xmlns:am3d="http://schemas.microsoft.com/office/drawing/2017/model3d" xmlns:o="urn:schemas-microsoft-com:office:office" xmlns:oel="http://schemas.microsoft.com/office/2019/extlst" xmlns:r="http://schemas.openxmlformats.org/officeDocument/2006/relationships" xmlns:m="http://schemas.openxmlformats.org/officeDocument/2006/math" xmlns:v="urn:schemas-microsoft-com:vml" xmlns:wp14="http://schemas.microsoft.com/office/word/2010/wordprocessingDrawing" xmlns:wp="http://schemas.openxmlformats.org/drawingml/2006/wordprocessingDrawing" xmlns:w10="urn:schemas-microsoft-com:office:word" xmlns:w="http://schemas.openxmlformats.org/wordprocessingml/2006/main" xmlns:w14="http://schemas.microsoft.com/office/word/2010/wordml" xmlns:w15="http://schemas.microsoft.com/office/word/2012/wordml" xmlns:w16cex="http://schemas.microsoft.com/office/word/2018/wordml/cex" xmlns:w16cid="http://schemas.microsoft.com/office/word/2016/wordml/cid" xmlns:w16="http://schemas.microsoft.com/office/word/2018/wordml" xmlns:w16du="http://schemas.microsoft.com/office/word/2023/wordml/word16du" xmlns:w16sdtdh="http://schemas.microsoft.com/office/word/2020/wordml/sdtdatahash" xmlns:w16sdtfl="http://schemas.microsoft.com/office/word/2024/wordml/sdtformatlock" xmlns:w16se="http://schemas.microsoft.com/office/word/2015/wordml/symex" xmlns:wpg="http://schemas.microsoft.com/office/word/2010/wordprocessingGroup" xmlns:wpi="http://schemas.microsoft.com/office/word/2010/wordprocessingInk" xmlns:wne="http://schemas.microsoft.com/office/word/2006/wordml" xmlns:wps="http://schemas.microsoft.com/office/word/2010/wordprocessingShape" mc:Ignorable="w14 w15 w16se w16cid w16 w16cex w16sdtdh w16sdtfl w16du wp14">
+  <w:footnote w:type="separator" w:id="-1">
+    <w:p>
+      <w:pPr>
+        <w:spacing w:after="0" w:line="240" w:lineRule="auto"/>
+      </w:pPr>
+      <w:r>
+        <w:separator/>
+      </w:r>
+    </w:p>
+  </w:footnote>
+  <w:footnote w:type="continuationSeparator" w:id="0">
+    <w:p>
+      <w:pPr>
+        <w:spacing w:after="0" w:line="240" w:lineRule="auto"/>
+      </w:pPr>
+      <w:r>
+        <w:continuationSeparator/>
+      </w:r>
+    </w:p>
+  </w:footnote>
+</w:footnotes>
+</file>
+
+<file path=word/header1.xml><?xml version="1.0" encoding="utf-8"?>
+<w:hdr xmlns:wpc="http://schemas.microsoft.com/office/word/2010/wordprocessingCanvas" xmlns:cx="http://schemas.microsoft.com/office/drawing/2014/chartex" xmlns:cx1="http://schemas.microsoft.com/office/drawing/2015/9/8/chartex" xmlns:cx2="http://schemas.microsoft.com/office/drawing/2015/10/21/chartex" xmlns:cx3="http://schemas.microsoft.com/office/drawing/2016/5/9/chartex" xmlns:cx4="http://schemas.microsoft.com/office/drawing/2016/5/10/chartex" xmlns:cx5="http://schemas.microsoft.com/office/drawing/2016/5/11/chartex" xmlns:cx6="http://schemas.microsoft.com/office/drawing/2016/5/12/chartex" xmlns:cx7="http://schemas.microsoft.com/office/drawing/2016/5/13/chartex" xmlns:cx8="http://schemas.microsoft.com/office/drawing/2016/5/14/chartex" xmlns:mc="http://schemas.openxmlformats.org/markup-compatibility/2006" xmlns:aink="http://schemas.microsoft.com/office/drawing/2016/ink" xmlns:am3d="http://schemas.microsoft.com/office/drawing/2017/model3d" xmlns:o="urn:schemas-microsoft-com:office:office" xmlns:oel="http://schemas.microsoft.com/office/2019/extlst" xmlns:r="http://schemas.openxmlformats.org/officeDocument/2006/relationships" xmlns:m="http://schemas.openxmlformats.org/officeDocument/2006/math" xmlns:v="urn:schemas-microsoft-com:vml" xmlns:wp14="http://schemas.microsoft.com/office/word/2010/wordprocessingDrawing" xmlns:wp="http://schemas.openxmlformats.org/drawingml/2006/wordprocessingDrawing" xmlns:w10="urn:schemas-microsoft-com:office:word" xmlns:w="http://schemas.openxmlformats.org/wordprocessingml/2006/main" xmlns:w14="http://schemas.microsoft.com/office/word/2010/wordml" xmlns:w15="http://schemas.microsoft.com/office/word/2012/wordml" xmlns:w16cex="http://schemas.microsoft.com/office/word/2018/wordml/cex" xmlns:w16cid="http://schemas.microsoft.com/office/word/2016/wordml/cid" xmlns:w16="http://schemas.microsoft.com/office/word/2018/wordml" xmlns:w16du="http://schemas.microsoft.com/office/word/2023/wordml/word16du" xmlns:w16sdtdh="http://schemas.microsoft.com/office/word/2020/wordml/sdtdatahash" xmlns:w16sdtfl="http://schemas.microsoft.com/office/word/2024/wordml/sdtformatlock" xmlns:w16se="http://schemas.microsoft.com/office/word/2015/wordml/symex" xmlns:wpg="http://schemas.microsoft.com/office/word/2010/wordprocessingGroup" xmlns:wpi="http://schemas.microsoft.com/office/word/2010/wordprocessingInk" xmlns:wne="http://schemas.microsoft.com/office/word/2006/wordml" xmlns:wps="http://schemas.microsoft.com/office/word/2010/wordprocessingShape" mc:Ignorable="w14 w15 w16se w16cid w16 w16cex w16sdtdh w16sdtfl w16du wp14">
+  <w:p>
+    <w:pPr>
+      <w:pStyle w:val="Header"/>
+    </w:pPr>
+  </w:p>
+</w:hdr>
+</file>
+
+<file path=word/header2.xml><?xml version="1.0" encoding="utf-8"?>
+<w:hdr xmlns:wpc="http://schemas.microsoft.com/office/word/2010/wordprocessingCanvas" xmlns:cx="http://schemas.microsoft.com/office/drawing/2014/chartex" xmlns:cx1="http://schemas.microsoft.com/office/drawing/2015/9/8/chartex" xmlns:cx2="http://schemas.microsoft.com/office/drawing/2015/10/21/chartex" xmlns:cx3="http://schemas.microsoft.com/office/drawing/2016/5/9/chartex" xmlns:cx4="http://schemas.microsoft.com/office/drawing/2016/5/10/chartex" xmlns:cx5="http://schemas.microsoft.com/office/drawing/2016/5/11/chartex" xmlns:cx6="http://schemas.microsoft.com/office/drawing/2016/5/12/chartex" xmlns:cx7="http://schemas.microsoft.com/office/drawing/2016/5/13/chartex" xmlns:cx8="http://schemas.microsoft.com/office/drawing/2016/5/14/chartex" xmlns:mc="http://schemas.openxmlformats.org/markup-compatibility/2006" xmlns:aink="http://schemas.microsoft.com/office/drawing/2016/ink" xmlns:am3d="http://schemas.microsoft.com/office/drawing/2017/model3d" xmlns:o="urn:schemas-microsoft-com:office:office" xmlns:oel="http://schemas.microsoft.com/office/2019/extlst" xmlns:r="http://schemas.openxmlformats.org/officeDocument/2006/relationships" xmlns:m="http://schemas.openxmlformats.org/officeDocument/2006/math" xmlns:v="urn:schemas-microsoft-com:vml" xmlns:wp14="http://schemas.microsoft.com/office/word/2010/wordprocessingDrawing" xmlns:wp="http://schemas.openxmlformats.org/drawingml/2006/wordprocessingDrawing" xmlns:w10="urn:schemas-microsoft-com:office:word" xmlns:w="http://schemas.openxmlformats.org/wordprocessingml/2006/main" xmlns:w14="http://schemas.microsoft.com/office/word/2010/wordml" xmlns:w15="http://schemas.microsoft.com/office/word/2012/wordml" xmlns:w16cex="http://schemas.microsoft.com/office/word/2018/wordml/cex" xmlns:w16cid="http://schemas.microsoft.com/office/word/2016/wordml/cid" xmlns:w16="http://schemas.microsoft.com/office/word/2018/wordml" xmlns:w16du="http://schemas.microsoft.com/office/word/2023/wordml/word16du" xmlns:w16sdtdh="http://schemas.microsoft.com/office/word/2020/wordml/sdtdatahash" xmlns:w16sdtfl="http://schemas.microsoft.com/office/word/2024/wordml/sdtformatlock" xmlns:w16se="http://schemas.microsoft.com/office/word/2015/wordml/symex" xmlns:wpg="http://schemas.microsoft.com/office/word/2010/wordprocessingGroup" xmlns:wpi="http://schemas.microsoft.com/office/word/2010/wordprocessingInk" xmlns:wne="http://schemas.microsoft.com/office/word/2006/wordml" xmlns:wps="http://schemas.microsoft.com/office/word/2010/wordprocessingShape" mc:Ignorable="w14 w15 w16se w16cid w16 w16cex w16sdtdh w16sdtfl w16du wp14">
+  <w:p>
+    <w:pPr>
+      <w:pStyle w:val="Header"/>
+    </w:pPr>
+  </w:p>
+</w:hdr>
+</file>
+
+<file path=word/header3.xml><?xml version="1.0" encoding="utf-8"?>
+<w:hdr xmlns:wpc="http://schemas.microsoft.com/office/word/2010/wordprocessingCanvas" xmlns:cx="http://schemas.microsoft.com/office/drawing/2014/chartex" xmlns:cx1="http://schemas.microsoft.com/office/drawing/2015/9/8/chartex" xmlns:cx2="http://schemas.microsoft.com/office/drawing/2015/10/21/chartex" xmlns:cx3="http://schemas.microsoft.com/office/drawing/2016/5/9/chartex" xmlns:cx4="http://schemas.microsoft.com/office/drawing/2016/5/10/chartex" xmlns:cx5="http://schemas.microsoft.com/office/drawing/2016/5/11/chartex" xmlns:cx6="http://schemas.microsoft.com/office/drawing/2016/5/12/chartex" xmlns:cx7="http://schemas.microsoft.com/office/drawing/2016/5/13/chartex" xmlns:cx8="http://schemas.microsoft.com/office/drawing/2016/5/14/chartex" xmlns:mc="http://schemas.openxmlformats.org/markup-compatibility/2006" xmlns:aink="http://schemas.microsoft.com/office/drawing/2016/ink" xmlns:am3d="http://schemas.microsoft.com/office/drawing/2017/model3d" xmlns:o="urn:schemas-microsoft-com:office:office" xmlns:oel="http://schemas.microsoft.com/office/2019/extlst" xmlns:r="http://schemas.openxmlformats.org/officeDocument/2006/relationships" xmlns:m="http://schemas.openxmlformats.org/officeDocument/2006/math" xmlns:v="urn:schemas-microsoft-com:vml" xmlns:wp14="http://schemas.microsoft.com/office/word/2010/wordprocessingDrawing" xmlns:wp="http://schemas.openxmlformats.org/drawingml/2006/wordprocessingDrawing" xmlns:w10="urn:schemas-microsoft-com:office:word" xmlns:w="http://schemas.openxmlformats.org/wordprocessingml/2006/main" xmlns:w14="http://schemas.microsoft.com/office/word/2010/wordml" xmlns:w15="http://schemas.microsoft.com/office/word/2012/wordml" xmlns:w16cex="http://schemas.microsoft.com/office/word/2018/wordml/cex" xmlns:w16cid="http://schemas.microsoft.com/office/word/2016/wordml/cid" xmlns:w16="http://schemas.microsoft.com/office/word/2018/wordml" xmlns:w16du="http://schemas.microsoft.com/office/word/2023/wordml/word16du" xmlns:w16sdtdh="http://schemas.microsoft.com/office/word/2020/wordml/sdtdatahash" xmlns:w16sdtfl="http://schemas.microsoft.com/office/word/2024/wordml/sdtformatlock" xmlns:w16se="http://schemas.microsoft.com/office/word/2015/wordml/symex" xmlns:wpg="http://schemas.microsoft.com/office/word/2010/wordprocessingGroup" xmlns:wpi="http://schemas.microsoft.com/office/word/2010/wordprocessingInk" xmlns:wne="http://schemas.microsoft.com/office/word/2006/wordml" xmlns:wps="http://schemas.microsoft.com/office/word/2010/wordprocessingShape" mc:Ignorable="w14 w15 w16se w16cid w16 w16cex w16sdtdh w16sdtfl w16du wp14">
+  <w:p>
+    <w:pPr>
+      <w:pStyle w:val="Header"/>
+    </w:pPr>
+  </w:p>
+</w:hdr>
+</file>
+
+<file path=word/header4.xml><?xml version="1.0" encoding="utf-8"?>
+<w:hdr xmlns:wpc="http://schemas.microsoft.com/office/word/2010/wordprocessingCanvas" xmlns:cx="http://schemas.microsoft.com/office/drawing/2014/chartex" xmlns:cx1="http://schemas.microsoft.com/office/drawing/2015/9/8/chartex" xmlns:cx2="http://schemas.microsoft.com/office/drawing/2015/10/21/chartex" xmlns:cx3="http://schemas.microsoft.com/office/drawing/2016/5/9/chartex" xmlns:cx4="http://schemas.microsoft.com/office/drawing/2016/5/10/chartex" xmlns:cx5="http://schemas.microsoft.com/office/drawing/2016/5/11/chartex" xmlns:cx6="http://schemas.microsoft.com/office/drawing/2016/5/12/chartex" xmlns:cx7="http://schemas.microsoft.com/office/drawing/2016/5/13/chartex" xmlns:cx8="http://schemas.microsoft.com/office/drawing/2016/5/14/chartex" xmlns:mc="http://schemas.openxmlformats.org/markup-compatibility/2006" xmlns:aink="http://schemas.microsoft.com/office/drawing/2016/ink" xmlns:am3d="http://schemas.microsoft.com/office/drawing/2017/model3d" xmlns:o="urn:schemas-microsoft-com:office:office" xmlns:oel="http://schemas.microsoft.com/office/2019/extlst" xmlns:r="http://schemas.openxmlformats.org/officeDocument/2006/relationships" xmlns:m="http://schemas.openxmlformats.org/officeDocument/2006/math" xmlns:v="urn:schemas-microsoft-com:vml" xmlns:wp14="http://schemas.microsoft.com/office/word/2010/wordprocessingDrawing" xmlns:wp="http://schemas.openxmlformats.org/drawingml/2006/wordprocessingDrawing" xmlns:w10="urn:schemas-microsoft-com:office:word" xmlns:w="http://schemas.openxmlformats.org/wordprocessingml/2006/main" xmlns:w14="http://schemas.microsoft.com/office/word/2010/wordml" xmlns:w15="http://schemas.microsoft.com/office/word/2012/wordml" xmlns:w16cex="http://schemas.microsoft.com/office/word/2018/wordml/cex" xmlns:w16cid="http://schemas.microsoft.com/office/word/2016/wordml/cid" xmlns:w16="http://schemas.microsoft.com/office/word/2018/wordml" xmlns:w16du="http://schemas.microsoft.com/office/word/2023/wordml/word16du" xmlns:w16sdtdh="http://schemas.microsoft.com/office/word/2020/wordml/sdtdatahash" xmlns:w16sdtfl="http://schemas.microsoft.com/office/word/2024/wordml/sdtformatlock" xmlns:w16se="http://schemas.microsoft.com/office/word/2015/wordml/symex" xmlns:wpg="http://schemas.microsoft.com/office/word/2010/wordprocessingGroup" xmlns:wpi="http://schemas.microsoft.com/office/word/2010/wordprocessingInk" xmlns:wne="http://schemas.microsoft.com/office/word/2006/wordml" xmlns:wps="http://schemas.microsoft.com/office/word/2010/wordprocessingShape" mc:Ignorable="w14 w15 w16se w16cid w16 w16cex w16sdtdh w16sdtfl w16du wp14">
+  <w:p>
+    <w:pPr>
+      <w:pStyle w:val="Header"/>
+    </w:pPr>
+  </w:p>
+</w:hdr>
 </file>
 
 <file path=word/numbering.xml><?xml version="1.0" encoding="utf-8"?>
@@ -54254,6 +54470,50 @@
       <w14:ligatures w14:val="none"/>
     </w:rPr>
   </w:style>
+  <w:style w:type="paragraph" w:styleId="Header">
+    <w:name w:val="header"/>
+    <w:basedOn w:val="Normal"/>
+    <w:link w:val="HeaderChar"/>
+    <w:uiPriority w:val="99"/>
+    <w:unhideWhenUsed/>
+    <w:rsid w:val="00755F1B"/>
+    <w:pPr>
+      <w:tabs>
+        <w:tab w:val="center" w:pos="4513"/>
+        <w:tab w:val="right" w:pos="9026"/>
+      </w:tabs>
+      <w:spacing w:after="0" w:line="240" w:lineRule="auto"/>
+    </w:pPr>
+  </w:style>
+  <w:style w:type="character" w:customStyle="1" w:styleId="HeaderChar">
+    <w:name w:val="Header Char"/>
+    <w:basedOn w:val="DefaultParagraphFont"/>
+    <w:link w:val="Header"/>
+    <w:uiPriority w:val="99"/>
+    <w:rsid w:val="00755F1B"/>
+  </w:style>
+  <w:style w:type="paragraph" w:styleId="Footer">
+    <w:name w:val="footer"/>
+    <w:basedOn w:val="Normal"/>
+    <w:link w:val="FooterChar"/>
+    <w:uiPriority w:val="99"/>
+    <w:unhideWhenUsed/>
+    <w:rsid w:val="00755F1B"/>
+    <w:pPr>
+      <w:tabs>
+        <w:tab w:val="center" w:pos="4513"/>
+        <w:tab w:val="right" w:pos="9026"/>
+      </w:tabs>
+      <w:spacing w:after="0" w:line="240" w:lineRule="auto"/>
+    </w:pPr>
+  </w:style>
+  <w:style w:type="character" w:customStyle="1" w:styleId="FooterChar">
+    <w:name w:val="Footer Char"/>
+    <w:basedOn w:val="DefaultParagraphFont"/>
+    <w:link w:val="Footer"/>
+    <w:uiPriority w:val="99"/>
+    <w:rsid w:val="00755F1B"/>
+  </w:style>
 </w:styles>
 </file>
 

</xml_diff>